<commit_message>
Lesson 14 and 15 validated
</commit_message>
<xml_diff>
--- a/docs/Lessons/Lesson 00 - Standards/Book_Notes_and_ToDo.docx
+++ b/docs/Lessons/Lesson 00 - Standards/Book_Notes_and_ToDo.docx
@@ -2163,17 +2163,17 @@
         <w:t xml:space="preserve">☐ </w:t>
       </w:r>
       <w:r>
-        <w:t xml:space="preserve">NEW Lesson 15 deliverable, fully scoped and decided (Robert), but explicitly DEFERRED - do not start building yet: a "Complete Codebase" document per engine, handed to students at Lesson 15 so they can check their own work over the semester break and come back ready for Semester 2. Scope, as decided: (1) Engines - the active 5 (Scratch, Godot, Unity C#, GameMaker Code, and GameMaker Visual), matching the existing active-engine-scope decision; the 4 paused engines (GDevelop, TIC-80, 001 Game Creator, Unreal) are explicitly out of scope for this deliverable. (2) Depth - NOT just the reliable Level 1/2 baseline; Level 3 "complete code" should be included wherever it exists, which means first BACKFILLING the known gap where several lessons' Keys only describe Level 3 in talking-point prose rather than full code (see the Rule 14 retrofit ToDo item), rather than skipping those lessons' Level 3 content. Robert's explicit reasoning for choosing the harder option: doing that backfill work now feeds forward into the book version too, so it isn't wasted effort scoped only to this one deliverable. (3) GameMaker Visual - represented as full node-flow diagrams per object, not prose description, extending the existing wireframe-diagram pilot (Lessons 5/7/8/9/11) to cover every GameMaker Visual object/script in the finished project completely, end to end. CRITICALLY: Robert explicitly said NOT to start this now - wait until the remaining lessons (through at least Lesson 15) have been reviewed first, because building this deliverable before that review is likely wasted effort (the reviewed lessons may still change, which would mean redoing the Complete Codebase work). Treat this as a planned, fully-scoped future task, not a current one - revisit once the remaining-lessons review is done.</w:t>
-      </w:r>
-      <w:r>
-        <w:rPr>
-          <w:i/>
-          <w:iCs/>
-          <w:color w:val="777777"/>
-          <w:sz w:val="18"/>
-          <w:szCs w:val="18"/>
-        </w:rPr>
-        <w:t xml:space="preserve">  (Robert's decision, fully scoped; explicitly deferred until the remaining lessons are reviewed - do not start early)</w:t>
+        <w:t xml:space="preserve">NEW Lesson 15 deliverable, fully scoped and decided (Robert): a "Complete Codebase" document per engine, handed to students at Lesson 15 so they can check their own work over the semester break and come back ready for Semester 2. Scope, as decided: (1) Engines - the active 5 (Scratch, Godot, Unity C#, GameMaker Code, and GameMaker Visual), matching the existing active-engine-scope decision; the 4 paused engines (GDevelop, TIC-80, 001 Game Creator, Unreal) are explicitly out of scope for this deliverable. (2) Depth - NOT just the reliable Level 1/2 baseline; Level 3 "complete code" should be included wherever it exists, which means first BACKFILLING the known gap where several lessons' Keys only describe Level 3 in talking-point prose rather than full code (see the Rule 14 retrofit ToDo item), rather than skipping those lessons' Level 3 content. Robert's explicit reasoning for choosing the harder option: doing that backfill work now feeds forward into the book version too, so it isn't wasted effort scoped only to this one deliverable. Updated during the Lesson 14 review: Lesson 14's own Level 3 (a "choose ONE of five" menu, deliberately left prose-only in that lesson's own Key, see the matching Notes &amp; Commentary entry) is explicitly folded into this deliverable's scope too - Robert wants all five stretch-feature options fully worked here, not just the usual combined-goals code. (3) GameMaker Visual - represented as full node-flow diagrams per object, not prose description, extending the existing wireframe-diagram pilot (Lessons 5/7/8/9/11) to cover every GameMaker Visual object/script in the finished project completely, end to end. Originally Robert said NOT to start this until the remaining lessons (through at least Lesson 15) had been reviewed, because building it early risked wasted rework. That review is now effectively done - Lessons 1-14 have all had their compliance passes, and only Lesson 15 itself remains - so this deliverable is ready to move from "scoped, not started" to active prep; see the matching task tracked this session.</w:t>
+      </w:r>
+      <w:r>
+        <w:rPr>
+          <w:i/>
+          <w:iCs/>
+          <w:color w:val="777777"/>
+          <w:sz w:val="18"/>
+          <w:szCs w:val="18"/>
+        </w:rPr>
+        <w:t xml:space="preserve">  (Robert's decision, fully scoped; remaining-lessons review is now essentially complete (only Lesson 15 left) - ready to start prepping, no longer blocked)</w:t>
       </w:r>
     </w:p>
     <w:p>
@@ -2313,6 +2313,36 @@
         <w:t xml:space="preserve">☐ </w:t>
       </w:r>
       <w:r>
+        <w:t xml:space="preserve">Code cleanup + Teacher's Notes candidate: replace every engine's ad hoc enemy spawn-position literal with a real, explainable centering formula, once wave-dependent enemy counts exist (Lesson 14 onward). Every engine's spawn code since Lesson 5 places enemies with a hand-picked starting offset and a hand-picked fixed spacing per engine (examples: GameMaker's 80 + enemy_count * 96, Godot's Vector2(150 + enemy_count * 200, 50), Unity's -4f + enemyIndex * 2f, and similar literals in GDevelop/TIC-80/Unreal/001GC) - fine when the count was always a fixed 5, but Lesson 14 lets wave-dependent counts grow past that without ever revisiting these numbers, so the line silently drifts off-center or off-screen as more enemies are added, and Lesson 14's own materials glossed over this (positions were guessed per engine rather than derived, by Robert's own description). Robert's proposed fix, a named formula rather than more guessing: enemy_x = starting_point + spacing, where (1) starting_point = [a chosen center x] - [a calculation based on the wave's enemy count] - shifting the line's start point left as the count grows so the whole row stays centered rather than just getting wider to one side; (2) spacing = enemy_index * (sprite_size + separation) - placing each new enemy an equal distance to the right of the previous one; and (3) separation = a fixed base spacing * [a calculation based on wave] - an explicit, named slot for shrinking the gap between enemies on later, more-crowded waves if needed, rather than a second guessed literal. The concrete win over the current approach: every number in the formula has a stated purpose (center point, per-enemy pitch, wave-based crowding adjustment), so a teacher or a student extending the game has an actual place to reason about and adjust spacing, instead of reverse-engineering what a semi-random literal was trying to do. Scope for the eventual pass: derive this formula once, verify it centers correctly for both wave 1's count (5) and a later wave's higher count, then retrofit it into Lesson 5's original spawn code and Lesson 14's wave-scaling code across all active engines (and ideally all 8, for the book), replacing the per-engine guessed literals. Worth a dedicated Teacher's Notes/Sidebar explaining the formula itself, since "why does the line start further left on later waves" is a very natural student question once counts visibly scale. Not done now - explicitly a future cleanup item, flagged by Robert after noticing Lesson 14's materials shipped with unexamined, non-scaling spawn positions.</w:t>
+      </w:r>
+      <w:r>
+        <w:rPr>
+          <w:i/>
+          <w:iCs/>
+          <w:color w:val="777777"/>
+          <w:sz w:val="18"/>
+          <w:szCs w:val="18"/>
+        </w:rPr>
+        <w:t xml:space="preserve">  (raised by Robert after the Lesson 14 review; code cleanup + new Teacher's Notes/Sidebar content, not yet started)</w:t>
+      </w:r>
+    </w:p>
+    <w:p>
+      <w:pPr>
+        <w:pStyle w:val="ListParagraph"/>
+        <w:numPr>
+          <w:ilvl w:val="0"/>
+          <w:numId w:val="2"/>
+        </w:numPr>
+        <w:spacing w:after="80"/>
+      </w:pPr>
+      <w:r>
+        <w:rPr>
+          <w:b/>
+          <w:bCs/>
+        </w:rPr>
+        <w:t xml:space="preserve">☐ </w:t>
+      </w:r>
+      <w:r>
         <w:t xml:space="preserve">Book-version fix candidate: Scratch's Lesson 13 double-kill race condition. Robert reports occasionally destroying two enemy clones with a single bullet (rare, but reproducible), and when it happens, score/enemies_remaining only register ONE hit - the exact symptom of the Stalemate bug returning, caused by the Lesson 3 decision to let the bullet keep traveling up-screen rather than destroying it on its first hit (so one bullet can still be "touching" a second overlapping enemy clone on a later frame/tick before either clone has deleted itself). Robert does not want this fixed in the live course now - noted for the book version only. Likely easy fixes worth evaluating when the book retrofit reaches Lesson 13: disable the bullet's own hit-detection after its first hit (a per-bullet "already_hit" flag, or delete/hide the bullet on its first touch like most of the other 7 engines already do) so it physically cannot register a second kill; or, if keeping the travel-through behavior is load-bearing for some other lesson's design, have each Enemy clone disable its own hitbox/touching-check the instant it's hit (consistent with Unity's Lesson 13 fix for the analogous problem - other.enabled = false on the Collider2D - and Godot's Hitbox.set_deferred("monitoring", false)) rather than changing the bullet. Worth cross-checking whether any of the other 7 engines share this same exposure once the bullet is allowed to keep moving past a hit, or whether Scratch is uniquely vulnerable because of its clone-based, no-unique-ID collision model (already documented elsewhere in this file as the reason Scratch's hit-detection ownership differs from the other engines).</w:t>
       </w:r>
       <w:r>
@@ -3420,6 +3450,82 @@
       </w:r>
       <w:r>
         <w:t xml:space="preserve">Robert shared two screenshots of his own working Level 3 Scratch project - Explosion's scripts and Enemy's full touching-Bullet branch - and asked for the canonical Key to be updated to match what he'd actually built and tested, rather than what was previously shipped. Three real differences, all adopted: (1) Explosion gained a separate "when green flag clicked -&gt; hide" script, more robust than the previous vague "hide it by default" Setup wording (which only meant toggling the Sprite pane's eye icon) - this was folded into Level 1 as well as Level 3, since a reliably-hidden Explosion at game start matters from the first hit onward, not just once Level 3's stretch goals are added. (2) The Level 3 flicker now uses three "next costume" blocks instead of three explicit "switch costume to [flash]"/"[normal]" blocks - Robert confirmed this works because Enemy's two costumes (normal, flash - the white enemy sprite imported back in Setup) are exactly two, in that order, so a fresh clone starting on normal just toggles back and forth each call. A new Mistakes bullet was added explaining the fragility this introduces: the toggle only works with exactly two costumes in that order, and breaks (cycling through all costumes instead of flashing) if Enemy ever gains a third. (3) Explosion's size-reset now happens before show/position ("set size to 100%" -&gt; show -&gt; go to x/y -&gt; 105%...) rather than after, matching Robert's exact tested order - functionally identical either way since Scratch runs synchronously to the next wait/yield point, but canonicalized to match what he built. Updated: the Handout's level1/level1Code/level3 arrays, and the Key's keyLevel3.Scratch code block and mistakes array. Rebuilt, PDF text-verified against the screenshots line by line, and reshipped both files. Separately, Robert flagged a genuine bug he's hit occasionally in his own Scratch project, explicitly NOT to be fixed in the live course: a bullet traveling through two overlapping enemy clones can destroy both, but score/enemies_remaining only register one hit, recreating the Stalemate bug - traced to the Lesson 3 decision to let bullets keep traveling rather than destroying them on first hit, combined with no per-bullet or per-clone guard against a second overlapping touch before either clone finishes deleting itself. Logged as a book-only ToDo with candidate fixes (a per-bullet already_hit flag, or disabling each clone's own touching-check immediately on hit, the same pattern Unity and Godot already use for their own Lesson 13 double-hit guards) rather than changed now.</w:t>
+      </w:r>
+      <w:r>
+        <w:t xml:space="preserve"/>
+      </w:r>
+    </w:p>
+    <w:p>
+      <w:pPr>
+        <w:spacing w:after="200"/>
+      </w:pPr>
+      <w:r>
+        <w:rPr>
+          <w:b/>
+          <w:bCs/>
+          <w:color w:val="1C4A86"/>
+        </w:rPr>
+        <w:t xml:space="preserve">Lesson 14 Rule 14 gap fixed (Keys had zero code for any level), plus three real content bugs found along the way - two by Claude's own audit, one caught by Robert directly against his own GameMaker project: </w:t>
+      </w:r>
+      <w:r>
+        <w:t xml:space="preserve">Robert asked for a Lesson 14 compliance sanity check and specifically flagged that none of the Keys had code blocks for any level. Investigation confirmed the gap was the full Lesson-13-style bug, not a partial one: keyData had no level1Code field at all and no wiring step copying it from handoutData, so every Lesson 14 Key rendered zero code for Level 1, 2, or 3. Fixed by porting the Lesson 13 wiring pattern (a keyData.forEach copying level1Code from the matching Handout entry) and writing real Level 2 code for all 8 engines (001 Game Creator stays verification-only in the Key, matching its own Handout, since this engine's confirmed action set has no verified runtime movement-speed control). Level 3 this lesson is structurally different from every other lesson - a "choose ONE of five independent stretch features" menu, not the usual small combinable stretch goals - so a single "all goals combined" Rule 14 code block doesn't fit. Asked Robert directly rather than deciding unilaterally; his answer: keep Level 3 prose-only in the Lesson 14 Key with an explicit documented-exception note (added), and build full worked solutions for all five options later as part of the Lesson 15 wrap-up "Complete Codebase" send-home materials - tracked as a new ToDo. While writing the Level 1/2 code, the same audit caught two more real issues on its own: Unity's shown code had regressed to generic i/e loop-variable names where Lesson 5 deliberately established enemyIndex/newEnemy specifically to avoid shadowing GameManager.enemyCount (fixed in the Handout and Key, both code and prose); and Unity's Visual Scripting altPath told students to target "the enemy's own EnemyMover script" - a name that appears nowhere else anywhere in the project, almost certainly fabricated rather than real, corrected to reference the actual Enemy component. GameMaker also got a Rule 11/12 naming-drift fix in the same pass: a new `inst` variable name had been introduced for the created instance, where Lesson 5 established `new_enemy` - renamed throughout.</w:t>
+      </w:r>
+      <w:r>
+        <w:t xml:space="preserve"/>
+      </w:r>
+    </w:p>
+    <w:p>
+      <w:pPr>
+        <w:spacing w:after="200"/>
+      </w:pPr>
+      <w:r>
+        <w:rPr>
+          <w:b/>
+          <w:bCs/>
+          <w:color w:val="1C4A86"/>
+        </w:rPr>
+        <w:t xml:space="preserve">Robert caught a genuine GameMaker architecture regression in the Lesson 14 materials Claude had just shipped - a real miss, not a style difference: </w:t>
+      </w:r>
+      <w:r>
+        <w:t xml:space="preserve">After the Rule 14 fix above shipped, Robert asked directly: his own GameMaker project doesn't have a repeat loop in spawn_enemies() (it's a for loop), and his win-check lives in wave_cleared(), not in obj_bullet - were these regressions, or legitimate Level 2/3 differences? Checked against Lesson 5 and Lesson 11's own canonical content directly: both of Robert's observations were correct, and both were genuine bugs Claude introduced while writing Lesson 14's GameMaker code, not acceptable variations. (1) GameMaker's GML CODE path has used a for loop ("for (var enemy_count = 0; enemy_count &lt; N; enemy_count++)") since Lesson 5 - Lesson 14's shipped code used "repeat (4 + obj_gamemanager.wave)" instead, a block-style construct that was never canonical for the Code path (repeat IS correctly used on the separate GML VISUAL path, established the same way since Lesson 5 - that part was fine and was deliberately left alone). (2) Since the Lesson 10/11 Stalemate fix, the win-check and enemies_remaining reset for a cleared wave live inside a dedicated wave_cleared() function (called from both obj_bullet's Collision event and obj_enemy's escape branch), not inline in obj_bullet itself - Lesson 14's shipped content called this "obj_bullet's win-check else branch" throughout, a description that predates the Lesson 11 refactor and was never updated. Both bugs were isolated to the GameMaker Handout/Key content Claude had just written (not something Robert introduced) - likely because the Lesson 14 GameMaker code was drafted from memory/pattern-matching against what a GameMaker spawn routine "usually" looks like, rather than rechecked line-by-line against Lesson 5 and Lesson 11's actual shipped code before writing it. Fixed everywhere the bugs appeared: the Handout's level1/level1Code/trouble/altPath arrays, the Key's level1/level2Code/mistakes/teaches text, the ENGINE_DIAGRAMS caption, and - less obviously but just as real - the actual GML Visual node diagram SVG/PNG itself (diagram_gml_visual_l14_level1), which had baked the same wrong "obj_bullet's win-check Else branch" label AND the same inst-instead-of-new_enemy naming slip directly into the image, not just the surrounding prose; corrected via direct SVG text edit and regenerated to PNG with cairosvg (no original diagram-generator script survived in Build_Scripts to rerun). Lesson for the book pass: when writing a later lesson's code for an engine whose architecture already went through a mid-course refactor (GameMaker's Stalemate-fix wave_cleared() consolidation at Lesson 10/11 is the clearest example so far), explicitly re-read that engine's most recent canonical state before drafting new code, rather than relying on the general shape of the mechanic - this is the second time this project has shipped content describing a pre-refactor architecture as if it were still current (the first being Lesson 13's Godot regression to a stale function name/group check). Rebuilt, PDF-verified (text-grepped for any remaining "repeat (4 + obj_gamemanager" or "obj_bullet's win-check" or bare "inst" - none found), and reshipped both files plus the corrected diagram.</w:t>
+      </w:r>
+      <w:r>
+        <w:t xml:space="preserve"/>
+      </w:r>
+    </w:p>
+    <w:p>
+      <w:pPr>
+        <w:spacing w:after="200"/>
+      </w:pPr>
+      <w:r>
+        <w:rPr>
+          <w:b/>
+          <w:bCs/>
+          <w:color w:val="1C4A86"/>
+        </w:rPr>
+        <w:t xml:space="preserve">End-of-semester GDD template decision: single engine-agnostic document, not one per engine: </w:t>
+      </w:r>
+      <w:r>
+        <w:t xml:space="preserve">With Lesson 15 confirmed clean and the Complete Codebase send-home deliverable about to start, Robert raised a real open question for the matching GDD piece of that same send-home packet: since Semester 2 students will be designing and building their own games largely on their own, should the example GDD they're handed be one single document, or does it need to be split per engine to stay genuinely usable? Recommended, and Robert agreed: a single, engine-agnostic GDD. Reasoning checked against the project's own existing precedent before answering - the current Semester_01_Capstone_GDD.docx (build_semester01_capstone_gdd.js, 323 lines) was grepped for every engine name, and turned up exactly one incidental mention (a Design Notes bullet explaining why TIC-80 deliberately kept its original palette-tint recolor approach instead of switching to sprite-swap like the other seven engines) - meaning the existing, already-in-use capstone GDD has effectively been engine-agnostic all along, by construction rather than by accident, and that's worked. The underlying principle: a GDD properly describes WHAT a game is - mechanics, feel, progression, win/lose conditions, asset list, systems - not HOW it's implemented in a specific engine; that second question is exactly what the separate per-engine Complete Codebase deliverable (tracked above) already exists to answer, so splitting the GDD per engine would duplicate work the Codebase piece already covers. It's also a better teaching example for the stated goal: since Semester 2 students may pick any of the 8 engines - possibly a different one than they used in Semester 1 - a single, polished, best-practice example models a transferable design-writing skill, where 5-8 near-identical clones would dilute one very solid example into several merely-good ones, and would need maintaining in parallel going forward. Any genuinely engine-specific consideration (a technical feasibility note, an asset-pipeline quirk) gets a short appendix/sidebar section within the one document, the same pattern the existing capstone GDD already uses for its TIC-80 exception, rather than full per-engine duplication. Not yet started - this decision sets the shape of the deliverable before building begins.</w:t>
+      </w:r>
+      <w:r>
+        <w:t xml:space="preserve"/>
+      </w:r>
+    </w:p>
+    <w:p>
+      <w:pPr>
+        <w:spacing w:after="200"/>
+      </w:pPr>
+      <w:r>
+        <w:rPr>
+          <w:b/>
+          <w:bCs/>
+          <w:color w:val="1C4A86"/>
+        </w:rPr>
+        <w:t xml:space="preserve">Semester 1 GDD worked example built: mirrors the blank student template section-for-section, filled out completely, plus a new in-fiction backstory at Robert's request: </w:t>
+      </w:r>
+      <w:r>
+        <w:t xml:space="preserve">Robert first asked whether the existing Semester_01_Capstone_GDD.docx was sufficient as the send-home example, or needed more depth. Checked it directly: it's explicitly instructor-only ("Instructor Reference &amp; Target Spec - not distributed to students... it's the answer key, not a student handout") and built around a deliberately-staged reveal conceit, so handing it to students as-is would both contradict its own stated purpose and spoil that structure. Content coverage was confirmed complete (all Level 1/2/3 items and all five Lesson 14 stretch options present and accurate), but verbosity was lopsided - the feature lists are terse one-liners, while only two "Design Notes" entries modeled real design reasoning. Robert chose the thorough option: a full rewrite, reasoning-rich throughout, rather than a light reframe. He also asked, separately, whether a light in-fiction backstory (named player, named enemy, a setting, a reason they're fighting) could be added, specifically because he's emphasized to students that backstory helps guide consistent feature/mechanic decisions - explicitly not asking for prose quality, just real names and a working reason. Building the actual document surfaced the better structural choice: rather than inventing a new document shape, the existing blank Game_Design_Document_Template.docx (build_game_design_document.js) - the exact notebook students already fill in themselves, section by section, all year - was the right skeleton to mirror, so the worked example can sit side-by-side with a student's own blank copy and show them what each identical section looks like genuinely filled in. Built as a new file, Semester_01_GDD_Worked_Example.docx (build_semester01_gdd_worked_example.js), matching the template's exact sections (The Big Picture, Core Gameplay, World &amp; Characters, Levels/Structure, Visual Art Plan, Audio Plan, Scope &amp; Milestones, The Five Disciplines, Design Journal/Change Log) plus two new sections appended specifically for the worked example (not added to the blank student template itself): a short, honest retrospective naming three real things that could have gone better (consolidating shared state earlier, the never-revisited Lesson 5 spawn-position literals flagged in the matching code-cleanup ToDo, prototyping a long stretch with no audio feedback before Lesson 12), and a closing bridge explicitly naming what changes once it's a student's own design in Semester 2. The backstory: a frontier sector ("the Halcyon Verge"), a lightly-staffed listening outpost ("Relay Station Kestrel"), a named ordinary pilot (callsign Vega, flying "the Lance") deliberately NOT written as a chosen-one or flagship to match the course's light/arcade-y tone, and an enemy faction ("the Drift," a self-replicating probe swarm, individual units called "driftlings") whose fiction directly explains two real mechanical choices rather than just decorating them: each wave is described as a recalibrated "brood," which is the in-story reason enemy count AND speed both scale with wave number (Lesson 14), and the Level 3 stretch feature actually built for this worked example - formation-marching movement, chosen as the ONE pick from Lesson 14's five-option menu rather than attempting several - is framed as a more coordinated, evolved brood type. One real inconsistency was caught and fixed during PDF review before shipping: an early draft hedged the formation-marching feature as something that "would show up if a student builds it" in one table while the Design Journal simultaneously described it as already chosen and built - reconciled to consistently treat it as actually built throughout (World &amp; Characters, the wave-tier table, the Design Journal, and the Five Disciplines notes all now agree). Rebuilt, PDF-verified (10 pages, visually spot-checked the cover, World &amp; Characters, and Design Journal pages; text-grepped for the old hedging language - none remained), and shipped to the Lessons folder alongside the existing template and master GDD.</w:t>
       </w:r>
       <w:r>
         <w:t xml:space="preserve"/>

</xml_diff>

<commit_message>
Unity Semester 1 Capstone: test plan not verified yet
</commit_message>
<xml_diff>
--- a/docs/Lessons/Lesson 00 - Standards/Book_Notes_and_ToDo.docx
+++ b/docs/Lessons/Lesson 00 - Standards/Book_Notes_and_ToDo.docx
@@ -2313,17 +2313,47 @@
         <w:t xml:space="preserve">☐ </w:t>
       </w:r>
       <w:r>
-        <w:t xml:space="preserve">Code cleanup + Teacher's Notes candidate: replace every engine's ad hoc enemy spawn-position literal with a real, explainable centering formula, once wave-dependent enemy counts exist (Lesson 14 onward). Every engine's spawn code since Lesson 5 places enemies with a hand-picked starting offset and a hand-picked fixed spacing per engine (examples: GameMaker's 80 + enemy_count * 96, Godot's Vector2(150 + enemy_count * 200, 50), Unity's -4f + enemyIndex * 2f, and similar literals in GDevelop/TIC-80/Unreal/001GC) - fine when the count was always a fixed 5, but Lesson 14 lets wave-dependent counts grow past that without ever revisiting these numbers, so the line silently drifts off-center or off-screen as more enemies are added, and Lesson 14's own materials glossed over this (positions were guessed per engine rather than derived, by Robert's own description). Robert's proposed fix, a named formula rather than more guessing: enemy_x = starting_point + spacing, where (1) starting_point = [a chosen center x] - [a calculation based on the wave's enemy count] - shifting the line's start point left as the count grows so the whole row stays centered rather than just getting wider to one side; (2) spacing = enemy_index * (sprite_size + separation) - placing each new enemy an equal distance to the right of the previous one; and (3) separation = a fixed base spacing * [a calculation based on wave] - an explicit, named slot for shrinking the gap between enemies on later, more-crowded waves if needed, rather than a second guessed literal. The concrete win over the current approach: every number in the formula has a stated purpose (center point, per-enemy pitch, wave-based crowding adjustment), so a teacher or a student extending the game has an actual place to reason about and adjust spacing, instead of reverse-engineering what a semi-random literal was trying to do. Scope for the eventual pass: derive this formula once, verify it centers correctly for both wave 1's count (5) and a later wave's higher count, then retrofit it into Lesson 5's original spawn code and Lesson 14's wave-scaling code across all active engines (and ideally all 8, for the book), replacing the per-engine guessed literals. Worth a dedicated Teacher's Notes/Sidebar explaining the formula itself, since "why does the line start further left on later waves" is a very natural student question once counts visibly scale. Not done now - explicitly a future cleanup item, flagged by Robert after noticing Lesson 14's materials shipped with unexamined, non-scaling spawn positions.</w:t>
-      </w:r>
-      <w:r>
-        <w:rPr>
-          <w:i/>
-          <w:iCs/>
-          <w:color w:val="777777"/>
-          <w:sz w:val="18"/>
-          <w:szCs w:val="18"/>
-        </w:rPr>
-        <w:t xml:space="preserve">  (raised by Robert after the Lesson 14 review; code cleanup + new Teacher's Notes/Sidebar content, not yet started)</w:t>
+        <w:t xml:space="preserve">Semester 2 lesson flag: revisit Unity's title/game-over screen and explain the OnGUI-to-Canvas tradeoff. The Unity Complete Codebase deliverable kept the Lesson 14 title/game-over stretch feature on OnGUI (immediate-mode), matching the win/lose banner already established in Lesson 10, rather than moving to a UI Canvas as Lesson 14's original Handout hint suggested - a deliberate simplicity call for Semester 1, confirmed by Robert. Flag a specific Semester 2 lesson (once UI/Canvas work is actually introduced) to come back to this exact file and explain explicitly why a real project would eventually move off OnGUI - more flexible layout, proper UI event handling, better performance with many elements, designer-editable UI without touching code - framed as a genuine 'simple now, here's what you'd reach for once requirements grow' teaching moment, the same kind of before/after contrast the course has used elsewhere (e.g. GameMaker's obj_spawner retirement, the static-vs-instance GameManager discussion).</w:t>
+      </w:r>
+      <w:r>
+        <w:rPr>
+          <w:i/>
+          <w:iCs/>
+          <w:color w:val="777777"/>
+          <w:sz w:val="18"/>
+          <w:szCs w:val="18"/>
+        </w:rPr>
+        <w:t xml:space="preserve">  (raised by Robert during the Unity Complete Codebase review; needs a specific Semester 2 lesson slot once Canvas is taught)</w:t>
+      </w:r>
+    </w:p>
+    <w:p>
+      <w:pPr>
+        <w:pStyle w:val="ListParagraph"/>
+        <w:numPr>
+          <w:ilvl w:val="0"/>
+          <w:numId w:val="2"/>
+        </w:numPr>
+        <w:spacing w:after="80"/>
+      </w:pPr>
+      <w:r>
+        <w:rPr>
+          <w:b/>
+          <w:bCs/>
+        </w:rPr>
+        <w:t xml:space="preserve">☐ </w:t>
+      </w:r>
+      <w:r>
+        <w:t xml:space="preserve">Code cleanup + Teacher's Notes candidate: replace every engine's ad hoc enemy spawn-position literal with a real, explainable centering formula, once wave-dependent enemy counts exist (Lesson 14 onward). Every engine's spawn code since Lesson 5 places enemies with a hand-picked starting offset and a hand-picked fixed spacing per engine (examples: GameMaker's 80 + enemy_count * 96, Godot's Vector2(150 + enemy_count * 200, 50), Unity's -4f + enemyIndex * 2f, and similar literals in GDevelop/TIC-80/Unreal/001GC) - fine when the count was always a fixed 5, but Lesson 14 lets wave-dependent counts grow past that without ever revisiting these numbers, so the line silently drifts off-center or off-screen as more enemies are added, and Lesson 14's own materials glossed over this (positions were guessed per engine rather than derived, by Robert's own description). Robert's proposed fix, a named formula rather than more guessing: enemy_x = starting_point + spacing, where (1) starting_point = [a chosen center x] - [a calculation based on the wave's enemy count] - shifting the line's start point left as the count grows so the whole row stays centered rather than just getting wider to one side; (2) spacing = enemy_index * (sprite_size + separation) - placing each new enemy an equal distance to the right of the previous one; and (3) separation = a fixed base spacing * [a calculation based on wave] - an explicit, named slot for shrinking the gap between enemies on later, more-crowded waves if needed, rather than a second guessed literal. The concrete win over the current approach: every number in the formula has a stated purpose (center point, per-enemy pitch, wave-based crowding adjustment), so a teacher or a student extending the game has an actual place to reason about and adjust spacing, instead of reverse-engineering what a semi-random literal was trying to do. Scope for the eventual pass: derive this formula once, verify it centers correctly for both wave 1's count (5) and a later wave's higher count, then retrofit it into Lesson 5's original spawn code and Lesson 14's wave-scaling code across all active engines (and ideally all 8, for the book), replacing the per-engine guessed literals. Worth a dedicated Teacher's Notes/Sidebar explaining the formula itself, since "why does the line start further left on later waves" is a very natural student question once counts visibly scale. RESOLVED (formula found, not yet retrofitted into Lessons 5/14's live course materials): while reconciling Robert's own Unity project for the Complete Codebase deliverable, his actual EnemySpawner.cs turned out to already contain exactly this kind of formula, independently arrived at: pos.x = (-3f - GameManager.wave) + enemyIndex * 2f. Verified algebraically that this centers the row at x = 0 for ANY wave's enemy count: the row's center = start + (count-1)*spacing/2 = (-3-wave) + ((4+wave)-1)*2/2 = (-3-wave) + (3+wave) = 0, always - so it satisfies the "stays centered as count grows" goal with a simpler two-term formula than originally envisioned (a fixed per-enemy spacing of 2, no separate wave-based crowding/shrink term was needed for this course's wave range). Robert confirmed this formula as canonical going forward. Scope still open: retrofit into Lesson 5's original spawn code and Lesson 14's wave-scaling code (currently still the old guessed literals) across all 5 active engines, translated into each engine's own coordinate system/units, plus the planned Teacher's Notes/Sidebar explaining the derivation. Currently applied only in the new Unity Complete Codebase send-home deliverable (EnemySpawner.cs); the live Lesson 5/14 Unity Handout/Key still show the older guessed literal and have not yet been retrofitted either.</w:t>
+      </w:r>
+      <w:r>
+        <w:rPr>
+          <w:i/>
+          <w:iCs/>
+          <w:color w:val="777777"/>
+          <w:sz w:val="18"/>
+          <w:szCs w:val="18"/>
+        </w:rPr>
+        <w:t xml:space="preserve">  (raised by Robert after the Lesson 14 review; formula found and confirmed canonical during the Unity Complete Codebase build - retrofit into live Lessons 5/14 (all engines) and the Sidebar still open)</w:t>
       </w:r>
     </w:p>
     <w:p>
@@ -3526,6 +3556,25 @@
       </w:r>
       <w:r>
         <w:t xml:space="preserve">Robert first asked whether the existing Semester_01_Capstone_GDD.docx was sufficient as the send-home example, or needed more depth. Checked it directly: it's explicitly instructor-only ("Instructor Reference &amp; Target Spec - not distributed to students... it's the answer key, not a student handout") and built around a deliberately-staged reveal conceit, so handing it to students as-is would both contradict its own stated purpose and spoil that structure. Content coverage was confirmed complete (all Level 1/2/3 items and all five Lesson 14 stretch options present and accurate), but verbosity was lopsided - the feature lists are terse one-liners, while only two "Design Notes" entries modeled real design reasoning. Robert chose the thorough option: a full rewrite, reasoning-rich throughout, rather than a light reframe. He also asked, separately, whether a light in-fiction backstory (named player, named enemy, a setting, a reason they're fighting) could be added, specifically because he's emphasized to students that backstory helps guide consistent feature/mechanic decisions - explicitly not asking for prose quality, just real names and a working reason. Building the actual document surfaced the better structural choice: rather than inventing a new document shape, the existing blank Game_Design_Document_Template.docx (build_game_design_document.js) - the exact notebook students already fill in themselves, section by section, all year - was the right skeleton to mirror, so the worked example can sit side-by-side with a student's own blank copy and show them what each identical section looks like genuinely filled in. Built as a new file, Semester_01_GDD_Worked_Example.docx (build_semester01_gdd_worked_example.js), matching the template's exact sections (The Big Picture, Core Gameplay, World &amp; Characters, Levels/Structure, Visual Art Plan, Audio Plan, Scope &amp; Milestones, The Five Disciplines, Design Journal/Change Log) plus two new sections appended specifically for the worked example (not added to the blank student template itself): a short, honest retrospective naming three real things that could have gone better (consolidating shared state earlier, the never-revisited Lesson 5 spawn-position literals flagged in the matching code-cleanup ToDo, prototyping a long stretch with no audio feedback before Lesson 12), and a closing bridge explicitly naming what changes once it's a student's own design in Semester 2. The backstory: a frontier sector ("the Halcyon Verge"), a lightly-staffed listening outpost ("Relay Station Kestrel"), a named ordinary pilot (callsign Vega, flying "the Lance") deliberately NOT written as a chosen-one or flagship to match the course's light/arcade-y tone, and an enemy faction ("the Drift," a self-replicating probe swarm, individual units called "driftlings") whose fiction directly explains two real mechanical choices rather than just decorating them: each wave is described as a recalibrated "brood," which is the in-story reason enemy count AND speed both scale with wave number (Lesson 14), and the Level 3 stretch feature actually built for this worked example - formation-marching movement, chosen as the ONE pick from Lesson 14's five-option menu rather than attempting several - is framed as a more coordinated, evolved brood type. One real inconsistency was caught and fixed during PDF review before shipping: an early draft hedged the formation-marching feature as something that "would show up if a student builds it" in one table while the Design Journal simultaneously described it as already chosen and built - reconciled to consistently treat it as actually built throughout (World &amp; Characters, the wave-tier table, the Design Journal, and the Five Disciplines notes all now agree). Rebuilt, PDF-verified (10 pages, visually spot-checked the cover, World &amp; Characters, and Design Journal pages; text-grepped for the old hedging language - none remained), and shipped to the Lessons folder alongside the existing template and master GDD.</w:t>
+      </w:r>
+      <w:r>
+        <w:t xml:space="preserve"/>
+      </w:r>
+    </w:p>
+    <w:p>
+      <w:pPr>
+        <w:spacing w:after="200"/>
+      </w:pPr>
+      <w:r>
+        <w:rPr>
+          <w:b/>
+          <w:bCs/>
+          <w:color w:val="1C4A86"/>
+        </w:rPr>
+        <w:t xml:space="preserve">Unity Complete Codebase built: all five Lesson 14 stretch options implemented together, plus a wave-parity design decision worth reusing in the other 4 engines: </w:t>
+      </w:r>
+      <w:r>
+        <w:t xml:space="preserve">First of the 5-engine Complete Codebase send-home deliverable (Robert's 12-guideline scope for this project: active engines only, canonical-first with gentle refinement, all stretch options built together rather than one choice, cross-engine naming consistency, no diff-style highlighting, a companion Setup Guide, deferred Test Plan and Publish guide). Unity went first since Robert knows it best. Assembled from Robert's own (already-reconciled) MiniGame project plus every lesson's canonical Teacher's Key content, with a handful of further deviations found and resolved in his project along the way (a hardcoded enemiesRemaining = 5 that should have been 4 + wave in three spots, an untaught per-frame speed recompute, a cosmetic tint alternation and bullet flash with no lesson tie, a leftover HUD debug field, a stray using). Two of his deviations were deliberately KEPT as the canonical basis going forward rather than reverted (see the matching ToDo entry): his flicker-based hit timing, and critically his enemy spawn-position formula, which resolved the open spawn-position-formula ToDo outright. Four new scripts (Shield.cs, PowerUp.cs, PowerUpSpawner.cs, FormationController.cs) implement all five of Lesson 14's stretch options at once rather than Lesson 14's original "choose ONE" framing - Robert's explicit instruction for this deliverable, which does supersede the Lesson 14 Handout/Key's own framing for THIS document only (the live Lesson 14 materials are unchanged; students still pick one during the actual lesson). The one real design conflict - formation-marching movement and Enemy.cs's own independent lane descent can't both own movement for the same enemy at once - was first resolved as a static on/off switch, then upgraded at Robert's direction to a wave-parity rule: formationModeActive is now computed as GameManager.wave % 2 == 0, so even waves march in formation and odd waves use lane descent. Robert's own framing for why: this turns a conflict-resolution mechanism into an actual wave-to-wave variety feature (wave 1: 5 enemies, lane descent; wave 2: 6 enemies, formation march; wave 3: 7 enemies, faster lane descent) rather than just picking one mode and leaving it fixed for the whole run - worth carrying the same wave-parity idea into the other 4 engines' Complete Codebase builds for consistency, not just resolving their version of the same conflict a different way. The title/game-over screen stayed on OnGUI (matching the Lesson 10 win/lose banner already in place) rather than moving to a UI Canvas as Lesson 14's original hint suggested - Robert's call, confirmed, with a new ToDo (below) to revisit WHY in a Semester 2 lesson once Canvas is actually taught. Shipped to Lessons/Complete_Codebase/Unity.docx and .pdf. Next in the engine order: Godot, then GameMaker (script), then GameMaker (Visual), then Scratch - one at a time, each paused for Robert's review before the next begins, per his explicit direction to limit wasted effort if a design call needs revisiting.</w:t>
       </w:r>
       <w:r>
         <w:t xml:space="preserve"/>

</xml_diff>